<commit_message>
fix: strengthen URL validation and assignment verification
</commit_message>
<xml_diff>
--- a/report/MSCS633_Hands_On_Assignment_2_Report.docx
+++ b/report/MSCS633_Hands_On_Assignment_2_Report.docx
@@ -102,7 +102,7 @@
     </w:p>
     <w:p>
       <w:r>
-        <w:t>The saved PNG was independently decoded with the built-in macOS Vision framework, which returned the exact repository URL. All 10 unittest tests passed. Python compilation and Ruff style/import checks passed. The GUI smoke check was automated; student manual review and phone scanning are not claimed. macOS rejected the screenshot capture, so the only outstanding artifact step is capturing the live window and inserting it into this report.</w:t>
+        <w:t>The saved PNG was independently decoded with the built-in macOS Vision framework, which returned the exact repository URL. All 14 unittest tests passed, including checks that invalid or oversized input preserves a previously generated PNG. Python compilation and Ruff style/import checks passed. The GUI smoke check was automated; student manual review and phone scanning are not claimed. macOS rejected the screenshot capture, so the only outstanding artifact step is capturing the live window and inserting it into this report.</w:t>
       </w:r>
     </w:p>
     <w:p>
@@ -114,9 +114,15 @@
       </w:r>
     </w:p>
     <w:p>
-      <w:r>
-        <w:t>https://github.com/AshishM26/MSCS633_Assignment_2_QR_Gen</w:t>
-      </w:r>
+      <w:hyperlink r:id="rId9">
+        <w:r>
+          <w:rPr>
+            <w:color w:val="0563C1"/>
+            <w:u w:val="single"/>
+          </w:rPr>
+          <w:t>https://github.com/AshishM26/MSCS633_Assignment_2_QR_Gen</w:t>
+        </w:r>
+      </w:hyperlink>
     </w:p>
     <w:p>
       <w:pPr>

</xml_diff>

<commit_message>
docs: embed genuine application screenshot and finalize submission
</commit_message>
<xml_diff>
--- a/report/MSCS633_Hands_On_Assignment_2_Report.docx
+++ b/report/MSCS633_Hands_On_Assignment_2_Report.docx
@@ -53,6 +53,7 @@
     <w:p>
       <w:pPr>
         <w:pStyle w:val="Heading1"/>
+        <w:pageBreakBefore/>
       </w:pPr>
       <w:r>
         <w:t>3. Application Output</w:t>
@@ -60,18 +61,43 @@
     </w:p>
     <w:p>
       <w:pPr>
-        <w:spacing w:before="240" w:after="360"/>
+        <w:keepNext/>
+        <w:spacing w:before="0" w:after="0"/>
+        <w:jc w:val="center"/>
       </w:pPr>
       <w:r>
-        <w:rPr>
-          <w:b/>
-        </w:rPr>
-        <w:t>SCREENSHOT REQUIRED — Insert the genuine running-application screenshot here before submission.</w:t>
-      </w:r>
-    </w:p>
-    <w:p>
-      <w:r>
-        <w:t>Launch the app, enter the repository URL shown in section 5, and click Generate QR Code. Capture the window with the URL, QR code, and success message visible. Save it as screenshots/application_output.png and replace this placeholder in Word.</w:t>
+        <w:drawing>
+          <wp:inline xmlns:a="http://schemas.openxmlformats.org/drawingml/2006/main" xmlns:pic="http://schemas.openxmlformats.org/drawingml/2006/picture">
+            <wp:extent cx="6035040" cy="6089166"/>
+            <wp:docPr id="1" name="Picture 1" descr="Genuine application screenshot showing the GitHub repository URL, generated QR code, success message, and saved PNG path."/>
+            <wp:cNvGraphicFramePr>
+              <a:graphicFrameLocks noChangeAspect="1"/>
+            </wp:cNvGraphicFramePr>
+            <a:graphic>
+              <a:graphicData uri="http://schemas.openxmlformats.org/drawingml/2006/picture">
+                <pic:pic>
+                  <pic:nvPicPr>
+                    <pic:cNvPr id="0" name="application_output.png"/>
+                    <pic:cNvPicPr/>
+                  </pic:nvPicPr>
+                  <pic:blipFill>
+                    <a:blip r:embed="rId10"/>
+                    <a:stretch>
+                      <a:fillRect/>
+                    </a:stretch>
+                  </pic:blipFill>
+                  <pic:spPr>
+                    <a:xfrm>
+                      <a:off x="0" y="0"/>
+                      <a:ext cx="6035040" cy="6089166"/>
+                    </a:xfrm>
+                    <a:prstGeom prst="rect"/>
+                  </pic:spPr>
+                </pic:pic>
+              </a:graphicData>
+            </a:graphic>
+          </wp:inline>
+        </w:drawing>
       </w:r>
     </w:p>
     <w:p>
@@ -79,7 +105,7 @@
         <w:pStyle w:val="Caption"/>
       </w:pPr>
       <w:r>
-        <w:t>Figure 1. QR Code Generator application successfully generating a QR code from the GitHub repository URL. (Caption prepared; screenshot pending.)</w:t>
+        <w:t>Figure 1. QR Code Generator application successfully generating a QR code from the GitHub repository URL.</w:t>
       </w:r>
     </w:p>
     <w:p>
@@ -102,7 +128,7 @@
     </w:p>
     <w:p>
       <w:r>
-        <w:t>The saved PNG was independently decoded with the built-in macOS Vision framework, which returned the exact repository URL. All 14 unittest tests passed, including checks that invalid or oversized input preserves a previously generated PNG. Python compilation and Ruff style/import checks passed. The GUI smoke check was automated; student manual review and phone scanning are not claimed. macOS rejected the screenshot capture, so the only outstanding artifact step is capturing the live window and inserting it into this report.</w:t>
+        <w:t>The saved PNG was independently decoded with the built-in macOS Vision framework, which returned the exact repository URL. All 14 unittest tests passed, including checks that invalid or oversized input preserves a previously generated PNG. Python compilation and Ruff style/import checks passed. The GUI smoke check was automated. Figure 1 is a genuine application screenshot supplied by the student, showing the repository URL, generated QR code, success message, and saved file path. No phone-scanning verification is claimed.</w:t>
       </w:r>
     </w:p>
     <w:p>
@@ -134,7 +160,7 @@
     </w:p>
     <w:p>
       <w:r>
-        <w:t>This implementation demonstrates URL validation, QR generation, modular Python functions, GUI event handling, and machine-readable output. The tests and setup instructions support reproducibility. Completing the screenshot evidence will make the report ready for final student review and submission.</w:t>
+        <w:t>This implementation demonstrates URL validation, QR generation, modular Python functions, GUI event handling, and machine-readable output. The tests and setup instructions support reproducibility. The source code, dependency manifest, example PNG, and Word report with application screenshot provide the required submission artifacts.</w:t>
       </w:r>
     </w:p>
     <w:sectPr>

</xml_diff>

<commit_message>
docs: remove redundant screenshot notes and streamline submission
</commit_message>
<xml_diff>
--- a/report/MSCS633_Hands_On_Assignment_2_Report.docx
+++ b/report/MSCS633_Hands_On_Assignment_2_Report.docx
@@ -29,7 +29,7 @@
     </w:p>
     <w:p>
       <w:r>
-        <w:t>The application accepts a URL and produces a machine-readable QR code that can be displayed and saved as a PNG. The assignment uses the title “AI QR Code Generator”; the implementation performs deterministic QR encoding and does not use a machine-learning model.</w:t>
+        <w:t>The application accepts a URL, displays its QR code, and saves it as a PNG. QR encoding is deterministic; no machine-learning model is required.</w:t>
       </w:r>
     </w:p>
     <w:p>
@@ -42,12 +42,12 @@
     </w:p>
     <w:p>
       <w:r>
-        <w:t>Python provides the application logic, while Tkinter supplies the URL field, Generate QR Code button, image preview, and status messages. URL validation uses urllib.parse with hostname and port checks. It accepts HTTP and HTTPS addresses, trims surrounding whitespace, and rejects empty or malformed input. Validation does not check website availability.</w:t>
+        <w:t>The Python application uses Tkinter for URL entry, image display, and status messages. Validation checks HTTP/HTTPS syntax, hostnames, and ports, and rejects empty or malformed input without contacting the website.</w:t>
       </w:r>
     </w:p>
     <w:p>
       <w:r>
-        <w:t>The qrcode library uses an automatically fitted QR version, medium error correction, box size 10, and border 4. Pillow supports the preview. pathlib creates the output directory and saves output/qr_code.png relative to the script. The GUI retains its PhotoImage reference so the image remains visible. Invalid input, oversized data, and saving/display errors produce messages instead of terminating the application.</w:t>
+        <w:t>The qrcode library uses automatic version fitting, medium error correction, 10-pixel modules, and a four-module border. Pillow supports the image preview, and pathlib saves output/qr_code.png relative to the script. Functions, type hints, docstrings, and focused comments keep the code readable. Input, capacity, and file errors produce clear messages.</w:t>
       </w:r>
     </w:p>
     <w:p>
@@ -123,12 +123,12 @@
     </w:p>
     <w:p>
       <w:r>
-        <w:t>Validation was performed on macOS using Python 3.11.1, Tk 8.6, qrcode 8.2, and Pillow 11.3.0. Dependency installation and pip check succeeded. The actual Tkinter window launched and its Generate button callback was exercised with valid, empty, malformed, and oversized input. The valid repository URL produced a visible preview and a non-empty saved PNG. Invalid input and oversized data displayed errors without closing the app.</w:t>
+        <w:t>Verified on macOS with Python 3.11.1, Tk 8.6, qrcode 8.2, and Pillow 11.3.0. Automated GUI checks confirmed that valid input displays and saves a QR code, while empty, malformed, and oversized input produces an error without closing the app.</w:t>
       </w:r>
     </w:p>
     <w:p>
       <w:r>
-        <w:t>The saved PNG was independently decoded with the built-in macOS Vision framework, which returned the exact repository URL. All 14 unittest tests passed, including checks that invalid or oversized input preserves a previously generated PNG. Python compilation and Ruff style/import checks passed. The GUI smoke check was automated. Figure 1 is a genuine application screenshot supplied by the student, showing the repository URL, generated QR code, success message, and saved file path. No phone-scanning verification is claimed.</w:t>
+        <w:t>All 14 unit tests, compilation, Ruff checks, and dependency checks passed. macOS Vision decoded the saved PNG to the exact repository URL. Figure 1 is the genuine application screenshot supplied by the student.</w:t>
       </w:r>
     </w:p>
     <w:p>
@@ -160,7 +160,7 @@
     </w:p>
     <w:p>
       <w:r>
-        <w:t>This implementation demonstrates URL validation, QR generation, modular Python functions, GUI event handling, and machine-readable output. The tests and setup instructions support reproducibility. The source code, dependency manifest, example PNG, and Word report with application screenshot provide the required submission artifacts.</w:t>
+        <w:t>The project demonstrates URL validation, QR generation, GUI event handling, and modular Python development. The source code, dependency manifest, tests, and setup instructions are available in the repository.</w:t>
       </w:r>
     </w:p>
     <w:sectPr>

</xml_diff>